<commit_message>
Fix Gambar citation mismatches in 3 Word BOP modules (#648)
Audited in-text "Gambar N" citations across all 42 Word modules (14 each
Opto/Getaran/Math4) via a 42-agent parallel workflow, cross-checking each
citation's described topic against the caption content of the number
cited and its neighbors. Captions themselves are always correct (auto-
incrementing counter), but manually-written prose citations can miscount.

Found 10 confirmed mismatches in 3 modules, all fixed via targeted
python-docx run-level text replacement:
- Getaran Modul 1: 4 mismatches (3-cycle rotation among Gambar 3/4/5)
- Opto Modul 3: 3 mismatches (off-by-one around spectrogram/heatmap figs)
- Math4 Modul 8: 3 mismatches (citing static diagram instead of DMF curve)

The other 39 modules were confirmed clean. PDFs regenerated for the 3
fixed modules; page counts unchanged (22/18/24), confirming the fix is
purely textual with no layout impact.

Co-authored-by: Claude <noreply@anthropic.com>
</commit_message>
<xml_diff>
--- a/Engineering-Mathematics/Modul-Word/Modul-8-PD-Non-Homogen-Solusi-Khusus-dan-Umum.docx
+++ b/Engineering-Mathematics/Modul-Word/Modul-8-PD-Non-Homogen-Solusi-Khusus-dan-Umum.docx
@@ -4626,7 +4626,7 @@
           <w:i w:val="0"/>
           <w:sz w:val="22"/>
         </w:rPr>
-        <w:t>menyetel volume speaker sesuai frekuensi ruangan (room resonance) membuat bass terasa jauh lebih kuat dari seharusnya pada frekuensi tertentu, sama seperti puncak kurva Dynamic Magnification Factor saat r=1 pada Gambar 5; audio engineer sengaja menghindari frekuensi tersebut atau meredamnya dengan bass trap (analog menambah redaman c).</w:t>
+        <w:t>menyetel volume speaker sesuai frekuensi ruangan (room resonance) membuat bass terasa jauh lebih kuat dari seharusnya pada frekuensi tertentu, sama seperti puncak kurva Dynamic Magnification Factor saat r=1 pada Gambar 6; audio engineer sengaja menghindari frekuensi tersebut atau meredamnya dengan bass trap (analog menambah redaman c).</w:t>
       </w:r>
     </w:p>
     <w:p>
@@ -5006,7 +5006,7 @@
           <w:i w:val="0"/>
           <w:sz w:val="22"/>
         </w:rPr>
-        <w:t>Studi kasus nyata pada industri: motor induksi 1500 rpm dengan ketidakseimbangan rotor ringan menghasilkan gaya eksitasi pada frekuensi putaran f=25 Hz (ω=2π·25≈157 rad/s). Bila frekuensi natural fondasi motor ωn juga berada di sekitar 157 rad/s (akibat kesalahan desain fondasi atau keausan bearing yang mengubah kekakuan efektif k), motor akan mengalami resonansi struktural: getaran fondasi memuncak jauh melebihi spesifikasi ISO 10816, berpotensi merusak bearing dan menyebabkan downtime tak terjadwal. Solusi rekayasa standar: (1) ubah kekakuan fondasi (tambah massa beton atau perkuat baut angkur) untuk menggeser ωn menjauh dari 157 rad/s, (2) tambah peredam viscous (dashpot) untuk menaikkan ζ dan menekan puncak DMF sesuai Gambar 5, atau (3) balancing ulang rotor untuk mengurangi F0 pada sumbernya langsung, strategi paling efektif karena mengurangi eksitasi di akar masalah, bukan hanya meredam gejalanya.</w:t>
+        <w:t>Studi kasus nyata pada industri: motor induksi 1500 rpm dengan ketidakseimbangan rotor ringan menghasilkan gaya eksitasi pada frekuensi putaran f=25 Hz (ω=2π·25≈157 rad/s). Bila frekuensi natural fondasi motor ωn juga berada di sekitar 157 rad/s (akibat kesalahan desain fondasi atau keausan bearing yang mengubah kekakuan efektif k), motor akan mengalami resonansi struktural: getaran fondasi memuncak jauh melebihi spesifikasi ISO 10816, berpotensi merusak bearing dan menyebabkan downtime tak terjadwal. Solusi rekayasa standar: (1) ubah kekakuan fondasi (tambah massa beton atau perkuat baut angkur) untuk menggeser ωn menjauh dari 157 rad/s, (2) tambah peredam viscous (dashpot) untuk menaikkan ζ dan menekan puncak DMF sesuai Gambar 6, atau (3) balancing ulang rotor untuk mengurangi F0 pada sumbernya langsung, strategi paling efektif karena mengurangi eksitasi di akar masalah, bukan hanya meredam gejalanya.</w:t>
       </w:r>
     </w:p>
     <w:p>
@@ -5281,7 +5281,7 @@
           <w:i w:val="0"/>
           <w:sz w:val="22"/>
         </w:rPr>
-        <w:t>scan nilai ω dari 0,1 sampai 3·ωn dengan langkah kecil, hitung amplitudo steady-state X(ω)=F0/akar((k-mω²)²+(cω)²) untuk beberapa nilai redaman c, plot seluruh kurva DMF sekaligus (mereproduksi Gambar 5), lalu identifikasi ω yang memaksimalkan X untuk tiap c dengan np.argmax dan verifikasi bahwa nilainya mendekati ωn saat c kecil.</w:t>
+        <w:t>scan nilai ω dari 0,1 sampai 3·ωn dengan langkah kecil, hitung amplitudo steady-state X(ω)=F0/akar((k-mω²)²+(cω)²) untuk beberapa nilai redaman c, plot seluruh kurva DMF sekaligus (mereproduksi Gambar 6), lalu identifikasi ω yang memaksimalkan X untuk tiap c dengan np.argmax dan verifikasi bahwa nilainya mendekati ωn saat c kecil.</w:t>
       </w:r>
     </w:p>
     <w:p>

</xml_diff>